<commit_message>
Partially created the frontend of Drafting
</commit_message>
<xml_diff>
--- a/Server/templates/lease_template.docx
+++ b/Server/templates/lease_template.docx
@@ -184,15 +184,13 @@
         <w:rPr>
           <w:rFonts w:ascii="Cambria" w:hAnsi="Cambria"/>
           <w:bCs/>
-          <w:highlight w:val="yellow"/>
-        </w:rPr>
-        <w:t>City</w:t>
+        </w:rPr>
+        <w:t>Agreement-Drafting City</w:t>
       </w:r>
       <w:r>
         <w:rPr>
           <w:rFonts w:ascii="Cambria" w:hAnsi="Cambria"/>
           <w:bCs/>
-          <w:highlight w:val="yellow"/>
         </w:rPr>
         <w:t>}</w:t>
       </w:r>
@@ -200,7 +198,6 @@
         <w:rPr>
           <w:rFonts w:ascii="Cambria" w:hAnsi="Cambria"/>
           <w:bCs/>
-          <w:highlight w:val="yellow"/>
         </w:rPr>
         <w:t xml:space="preserve">, </w:t>
       </w:r>
@@ -208,7 +205,6 @@
         <w:rPr>
           <w:rFonts w:ascii="Cambria" w:hAnsi="Cambria"/>
           <w:bCs/>
-          <w:highlight w:val="yellow"/>
         </w:rPr>
         <w:t>{</w:t>
       </w:r>
@@ -216,10 +212,39 @@
         <w:rPr>
           <w:rFonts w:ascii="Cambria" w:hAnsi="Cambria"/>
           <w:bCs/>
-          <w:highlight w:val="yellow"/>
-        </w:rPr>
-        <w:t>State</w:t>
-      </w:r>
+        </w:rPr>
+        <w:t>Agreement-Drafting State</w:t>
+      </w:r>
+      <w:r>
+        <w:rPr>
+          <w:rFonts w:ascii="Cambria" w:hAnsi="Cambria"/>
+          <w:bCs/>
+        </w:rPr>
+        <w:t>}</w:t>
+      </w:r>
+      <w:r>
+        <w:rPr>
+          <w:rFonts w:ascii="Cambria" w:hAnsi="Cambria"/>
+          <w:bCs/>
+        </w:rPr>
+        <w:t>, {</w:t>
+      </w:r>
+      <w:r>
+        <w:rPr>
+          <w:rFonts w:ascii="Cambria" w:hAnsi="Cambria"/>
+          <w:bCs/>
+        </w:rPr>
+        <w:t xml:space="preserve">Agreement-Drafting </w:t>
+      </w:r>
+      <w:proofErr w:type="spellStart"/>
+      <w:r>
+        <w:rPr>
+          <w:rFonts w:ascii="Cambria" w:hAnsi="Cambria"/>
+          <w:bCs/>
+        </w:rPr>
+        <w:t>Pincode</w:t>
+      </w:r>
+      <w:proofErr w:type="spellEnd"/>
       <w:r>
         <w:rPr>
           <w:rFonts w:ascii="Cambria" w:hAnsi="Cambria"/>
@@ -833,7 +858,15 @@
           <w:rFonts w:ascii="Cambria" w:hAnsi="Cambria"/>
           <w:highlight w:val="yellow"/>
         </w:rPr>
-        <w:t>Independent House / Apartment / Farm House / Residential Property</w:t>
+        <w:t xml:space="preserve">Independent House / Apartment / Farm House / Residential </w:t>
+      </w:r>
+      <w:r>
+        <w:rPr>
+          <w:rFonts w:ascii="Cambria" w:hAnsi="Cambria"/>
+          <w:highlight w:val="yellow"/>
+        </w:rPr>
+        <w:lastRenderedPageBreak/>
+        <w:t>Property</w:t>
       </w:r>
       <w:r>
         <w:rPr>
@@ -1031,7 +1064,6 @@
         <w:rPr>
           <w:rFonts w:ascii="Cambria" w:hAnsi="Cambria"/>
         </w:rPr>
-        <w:lastRenderedPageBreak/>
         <w:t xml:space="preserve">AND WHEREAS at the request of the Lessee, the Lessor has agreed to let the said premises to the tenant for a term of </w:t>
       </w:r>
       <w:r>
@@ -1336,14 +1368,14 @@
         <w:rPr>
           <w:rFonts w:ascii="Cambria" w:hAnsi="Cambria"/>
         </w:rPr>
-        <w:t xml:space="preserve">That the day to day repair jobs such as fuse blow out, replacement of light bulbs/tubes, leakage of water taps, maintenance of the water pump and other minor repairs, etc., shall be effected by the Lessee at its own cost, and any major repairs, either structural or to the electrical or water connection, plumbing leaks, water </w:t>
+        <w:t xml:space="preserve">That the day to day repair jobs such as fuse blow out, replacement of light bulbs/tubes, leakage of water taps, maintenance of the water pump and other minor </w:t>
       </w:r>
       <w:r>
         <w:rPr>
           <w:rFonts w:ascii="Cambria" w:hAnsi="Cambria"/>
         </w:rPr>
         <w:lastRenderedPageBreak/>
-        <w:t>seepage shall be attended to by the Lessor. In the event of the Lessor failing to carry out the repairs on receiving notice from the Lessee, the Lessee shall undertake the necessary repairs and the Lessor will be liable to immediately reimburse costs incurred by the Lessee.</w:t>
+        <w:t>repairs, etc., shall be effected by the Lessee at its own cost, and any major repairs, either structural or to the electrical or water connection, plumbing leaks, water seepage shall be attended to by the Lessor. In the event of the Lessor failing to carry out the repairs on receiving notice from the Lessee, the Lessee shall undertake the necessary repairs and the Lessor will be liable to immediately reimburse costs incurred by the Lessee.</w:t>
       </w:r>
     </w:p>
     <w:p>
@@ -1581,6 +1613,7 @@
         <w:rPr>
           <w:rFonts w:ascii="Cambria" w:hAnsi="Cambria"/>
         </w:rPr>
+        <w:lastRenderedPageBreak/>
         <w:t xml:space="preserve">That the Lessee has paid to the Lessor a sum of </w:t>
       </w:r>
       <w:r>
@@ -1606,14 +1639,7 @@
         <w:rPr>
           <w:rFonts w:ascii="Cambria" w:hAnsi="Cambria"/>
         </w:rPr>
-        <w:t xml:space="preserve"> as deposit, free of interest, which the Lessor does accept and acknowledge. </w:t>
-      </w:r>
-      <w:r>
-        <w:rPr>
-          <w:rFonts w:ascii="Cambria" w:hAnsi="Cambria"/>
-        </w:rPr>
-        <w:lastRenderedPageBreak/>
-        <w:t>This deposit is for the due performance and observance of the terms and conditions of this Agreement. The deposit shall be returned to the Lessee simultaneously with the Lessee vacating the said premises. In the event of failure on the part of the Lessor to refund the said deposit amount to the Lessee as aforesaid, the Lessee shall be entitled to continue to use and occupy the said premises without payment of any rent until the Lessor refunds the said amount</w:t>
+        <w:t xml:space="preserve"> as deposit, free of interest, which the Lessor does accept and acknowledge. This deposit is for the due performance and observance of the terms and conditions of this Agreement. The deposit shall be returned to the Lessee simultaneously with the Lessee vacating the said premises. In the event of failure on the part of the Lessor to refund the said deposit amount to the Lessee as aforesaid, the Lessee shall be entitled to continue to use and occupy the said premises without payment of any rent until the Lessor refunds the said amount</w:t>
       </w:r>
       <w:r>
         <w:rPr>
@@ -2101,7 +2127,6 @@
           <w:sz w:val="32"/>
           <w:szCs w:val="32"/>
         </w:rPr>
-        <w:lastRenderedPageBreak/>
         <w:t>ANNEXURE I</w:t>
       </w:r>
     </w:p>
@@ -2999,7 +3024,6 @@
   <w:style w:type="character" w:default="1" w:styleId="DefaultParagraphFont">
     <w:name w:val="Default Paragraph Font"/>
     <w:uiPriority w:val="1"/>
-    <w:semiHidden/>
     <w:unhideWhenUsed/>
   </w:style>
   <w:style w:type="table" w:default="1" w:styleId="TableNormal">

</xml_diff>

<commit_message>
Completed Drafting , Custom clause adding
</commit_message>
<xml_diff>
--- a/Server/templates/lease_template.docx
+++ b/Server/templates/lease_template.docx
@@ -234,8 +234,17 @@
           <w:rFonts w:ascii="Cambria" w:hAnsi="Cambria"/>
           <w:bCs/>
         </w:rPr>
-        <w:t>Agreement-Drafting Pincode</w:t>
-      </w:r>
+        <w:t xml:space="preserve">Agreement-Drafting </w:t>
+      </w:r>
+      <w:proofErr w:type="spellStart"/>
+      <w:r>
+        <w:rPr>
+          <w:rFonts w:ascii="Cambria" w:hAnsi="Cambria"/>
+          <w:bCs/>
+        </w:rPr>
+        <w:t>Pincode</w:t>
+      </w:r>
+      <w:proofErr w:type="spellEnd"/>
       <w:r>
         <w:rPr>
           <w:rFonts w:ascii="Cambria" w:hAnsi="Cambria"/>
@@ -325,11 +334,19 @@
         </w:rPr>
         <w:t>{</w:t>
       </w:r>
-      <w:r>
-        <w:rPr>
-          <w:rFonts w:ascii="Cambria" w:hAnsi="Cambria"/>
-        </w:rPr>
-        <w:t>Pincode(landlord)}</w:t>
+      <w:proofErr w:type="spellStart"/>
+      <w:r>
+        <w:rPr>
+          <w:rFonts w:ascii="Cambria" w:hAnsi="Cambria"/>
+        </w:rPr>
+        <w:t>Pincode</w:t>
+      </w:r>
+      <w:proofErr w:type="spellEnd"/>
+      <w:r>
+        <w:rPr>
+          <w:rFonts w:ascii="Cambria" w:hAnsi="Cambria"/>
+        </w:rPr>
+        <w:t>(landlord)}</w:t>
       </w:r>
       <w:r>
         <w:rPr>
@@ -355,11 +372,19 @@
         </w:rPr>
         <w:t>{</w:t>
       </w:r>
-      <w:r>
-        <w:rPr>
-          <w:rFonts w:ascii="Cambria" w:hAnsi="Cambria"/>
-        </w:rPr>
-        <w:t>Tenants's Full Name</w:t>
+      <w:proofErr w:type="spellStart"/>
+      <w:r>
+        <w:rPr>
+          <w:rFonts w:ascii="Cambria" w:hAnsi="Cambria"/>
+        </w:rPr>
+        <w:t>Tenants's</w:t>
+      </w:r>
+      <w:proofErr w:type="spellEnd"/>
+      <w:r>
+        <w:rPr>
+          <w:rFonts w:ascii="Cambria" w:hAnsi="Cambria"/>
+        </w:rPr>
+        <w:t xml:space="preserve"> Full Name</w:t>
       </w:r>
       <w:r>
         <w:rPr>
@@ -446,7 +471,21 @@
         <w:rPr>
           <w:rFonts w:ascii="Cambria" w:hAnsi="Cambria"/>
         </w:rPr>
-        <w:t>{Pincode(Tenant)}</w:t>
+        <w:t>{</w:t>
+      </w:r>
+      <w:proofErr w:type="spellStart"/>
+      <w:r>
+        <w:rPr>
+          <w:rFonts w:ascii="Cambria" w:hAnsi="Cambria"/>
+        </w:rPr>
+        <w:t>Pincode</w:t>
+      </w:r>
+      <w:proofErr w:type="spellEnd"/>
+      <w:r>
+        <w:rPr>
+          <w:rFonts w:ascii="Cambria" w:hAnsi="Cambria"/>
+        </w:rPr>
+        <w:t>(Tenant)}</w:t>
       </w:r>
       <w:r>
         <w:rPr>
@@ -486,7 +525,21 @@
         <w:rPr>
           <w:rFonts w:ascii="Cambria" w:hAnsi="Cambria"/>
         </w:rPr>
-        <w:t xml:space="preserve">1}, {Property Address Line 2}, {City(Property)}, {State(Property)}, {Pincode(Property)} </w:t>
+        <w:t>1}, {Property Address Line 2}, {City(Property)}, {State(Property)}, {</w:t>
+      </w:r>
+      <w:proofErr w:type="spellStart"/>
+      <w:r>
+        <w:rPr>
+          <w:rFonts w:ascii="Cambria" w:hAnsi="Cambria"/>
+        </w:rPr>
+        <w:t>Pincode</w:t>
+      </w:r>
+      <w:proofErr w:type="spellEnd"/>
+      <w:r>
+        <w:rPr>
+          <w:rFonts w:ascii="Cambria" w:hAnsi="Cambria"/>
+        </w:rPr>
+        <w:t xml:space="preserve">(Property)} </w:t>
       </w:r>
       <w:r>
         <w:rPr>
@@ -595,8 +648,16 @@
         <w:rPr>
           <w:rFonts w:ascii="Cambria" w:hAnsi="Cambria"/>
         </w:rPr>
-        <w:t>No. of Car Parkings</w:t>
-      </w:r>
+        <w:t xml:space="preserve">No. of Car </w:t>
+      </w:r>
+      <w:proofErr w:type="spellStart"/>
+      <w:r>
+        <w:rPr>
+          <w:rFonts w:ascii="Cambria" w:hAnsi="Cambria"/>
+        </w:rPr>
+        <w:t>Parkings</w:t>
+      </w:r>
+      <w:proofErr w:type="spellEnd"/>
       <w:r>
         <w:rPr>
           <w:rFonts w:ascii="Cambria" w:hAnsi="Cambria"/>
@@ -631,7 +692,21 @@
         <w:rPr>
           <w:rFonts w:ascii="Cambria" w:hAnsi="Cambria"/>
         </w:rPr>
-        <w:t>(in sqft.)</w:t>
+        <w:t xml:space="preserve">(in </w:t>
+      </w:r>
+      <w:proofErr w:type="spellStart"/>
+      <w:r>
+        <w:rPr>
+          <w:rFonts w:ascii="Cambria" w:hAnsi="Cambria"/>
+        </w:rPr>
+        <w:t>sqft</w:t>
+      </w:r>
+      <w:proofErr w:type="spellEnd"/>
+      <w:r>
+        <w:rPr>
+          <w:rFonts w:ascii="Cambria" w:hAnsi="Cambria"/>
+        </w:rPr>
+        <w:t>.)</w:t>
       </w:r>
       <w:r>
         <w:rPr>
@@ -643,7 +718,21 @@
         <w:rPr>
           <w:rFonts w:ascii="Cambria" w:hAnsi="Cambria"/>
         </w:rPr>
-        <w:t xml:space="preserve"> sqft. area</w:t>
+        <w:t xml:space="preserve"> </w:t>
+      </w:r>
+      <w:proofErr w:type="spellStart"/>
+      <w:r>
+        <w:rPr>
+          <w:rFonts w:ascii="Cambria" w:hAnsi="Cambria"/>
+        </w:rPr>
+        <w:t>sqft</w:t>
+      </w:r>
+      <w:proofErr w:type="spellEnd"/>
+      <w:r>
+        <w:rPr>
+          <w:rFonts w:ascii="Cambria" w:hAnsi="Cambria"/>
+        </w:rPr>
+        <w:t>. area</w:t>
       </w:r>
       <w:r>
         <w:rPr>
@@ -677,8 +766,24 @@
         <w:rPr>
           <w:rFonts w:ascii="Cambria" w:hAnsi="Cambria"/>
         </w:rPr>
-        <w:t>Years</w:t>
-      </w:r>
+        <w:t xml:space="preserve">For how many Years/Months is the lease </w:t>
+      </w:r>
+      <w:proofErr w:type="spellStart"/>
+      <w:proofErr w:type="gramStart"/>
+      <w:r>
+        <w:rPr>
+          <w:rFonts w:ascii="Cambria" w:hAnsi="Cambria"/>
+        </w:rPr>
+        <w:t>term?,</w:t>
+      </w:r>
+      <w:proofErr w:type="gramEnd"/>
+      <w:r>
+        <w:rPr>
+          <w:rFonts w:ascii="Cambria" w:hAnsi="Cambria"/>
+        </w:rPr>
+        <w:t>years</w:t>
+      </w:r>
+      <w:proofErr w:type="spellEnd"/>
       <w:r>
         <w:rPr>
           <w:rFonts w:ascii="Cambria" w:hAnsi="Cambria"/>
@@ -689,7 +794,45 @@
         <w:rPr>
           <w:rFonts w:ascii="Cambria" w:hAnsi="Cambria"/>
         </w:rPr>
-        <w:t>Years {Months}Months</w:t>
+        <w:t xml:space="preserve"> </w:t>
+      </w:r>
+      <w:r>
+        <w:rPr>
+          <w:rFonts w:ascii="Cambria" w:hAnsi="Cambria"/>
+        </w:rPr>
+        <w:t>Years {</w:t>
+      </w:r>
+      <w:r>
+        <w:rPr>
+          <w:rFonts w:ascii="Cambria" w:hAnsi="Cambria"/>
+        </w:rPr>
+        <w:t xml:space="preserve">For how many Years/Months is the lease </w:t>
+      </w:r>
+      <w:proofErr w:type="spellStart"/>
+      <w:r>
+        <w:rPr>
+          <w:rFonts w:ascii="Cambria" w:hAnsi="Cambria"/>
+        </w:rPr>
+        <w:t>term?,months</w:t>
+      </w:r>
+      <w:proofErr w:type="spellEnd"/>
+      <w:r>
+        <w:rPr>
+          <w:rFonts w:ascii="Cambria" w:hAnsi="Cambria"/>
+        </w:rPr>
+        <w:t>}</w:t>
+      </w:r>
+      <w:r>
+        <w:rPr>
+          <w:rFonts w:ascii="Cambria" w:hAnsi="Cambria"/>
+        </w:rPr>
+        <w:t xml:space="preserve"> </w:t>
+      </w:r>
+      <w:r>
+        <w:rPr>
+          <w:rFonts w:ascii="Cambria" w:hAnsi="Cambria"/>
+        </w:rPr>
+        <w:t>Months</w:t>
       </w:r>
       <w:r>
         <w:rPr>
@@ -791,7 +934,79 @@
         <w:rPr>
           <w:rFonts w:ascii="Cambria" w:hAnsi="Cambria"/>
         </w:rPr>
-        <w:t>{Years}Years {Months}Months.</w:t>
+        <w:t>{</w:t>
+      </w:r>
+      <w:r>
+        <w:rPr>
+          <w:rFonts w:ascii="Cambria" w:hAnsi="Cambria"/>
+        </w:rPr>
+        <w:t xml:space="preserve">For how many Years/Months is the lease </w:t>
+      </w:r>
+      <w:proofErr w:type="spellStart"/>
+      <w:proofErr w:type="gramStart"/>
+      <w:r>
+        <w:rPr>
+          <w:rFonts w:ascii="Cambria" w:hAnsi="Cambria"/>
+        </w:rPr>
+        <w:t>term?,</w:t>
+      </w:r>
+      <w:proofErr w:type="gramEnd"/>
+      <w:r>
+        <w:rPr>
+          <w:rFonts w:ascii="Cambria" w:hAnsi="Cambria"/>
+        </w:rPr>
+        <w:t>years</w:t>
+      </w:r>
+      <w:proofErr w:type="spellEnd"/>
+      <w:r>
+        <w:rPr>
+          <w:rFonts w:ascii="Cambria" w:hAnsi="Cambria"/>
+        </w:rPr>
+        <w:t>}</w:t>
+      </w:r>
+      <w:r>
+        <w:rPr>
+          <w:rFonts w:ascii="Cambria" w:hAnsi="Cambria"/>
+        </w:rPr>
+        <w:t xml:space="preserve"> </w:t>
+      </w:r>
+      <w:r>
+        <w:rPr>
+          <w:rFonts w:ascii="Cambria" w:hAnsi="Cambria"/>
+        </w:rPr>
+        <w:t>Years {</w:t>
+      </w:r>
+      <w:r>
+        <w:rPr>
+          <w:rFonts w:ascii="Cambria" w:hAnsi="Cambria"/>
+        </w:rPr>
+        <w:t xml:space="preserve">For how many Years/Months is the lease </w:t>
+      </w:r>
+      <w:proofErr w:type="spellStart"/>
+      <w:r>
+        <w:rPr>
+          <w:rFonts w:ascii="Cambria" w:hAnsi="Cambria"/>
+        </w:rPr>
+        <w:t>term?,months</w:t>
+      </w:r>
+      <w:proofErr w:type="spellEnd"/>
+      <w:r>
+        <w:rPr>
+          <w:rFonts w:ascii="Cambria" w:hAnsi="Cambria"/>
+        </w:rPr>
+        <w:t>}</w:t>
+      </w:r>
+      <w:r>
+        <w:rPr>
+          <w:rFonts w:ascii="Cambria" w:hAnsi="Cambria"/>
+        </w:rPr>
+        <w:t xml:space="preserve"> </w:t>
+      </w:r>
+      <w:r>
+        <w:rPr>
+          <w:rFonts w:ascii="Cambria" w:hAnsi="Cambria"/>
+        </w:rPr>
+        <w:t>Months.</w:t>
       </w:r>
       <w:r>
         <w:rPr>
@@ -915,14 +1130,36 @@
         <w:rPr>
           <w:rFonts w:ascii="Cambria" w:hAnsi="Cambria"/>
         </w:rPr>
-        <w:t xml:space="preserve">That the day to day repair jobs such as fuse blow out, replacement of light bulbs/tubes, leakage of water taps, maintenance of the water pump and other minor repairs, etc., shall be effected by the Lessee at its own cost, and any major repairs, </w:t>
-      </w:r>
-      <w:r>
-        <w:rPr>
-          <w:rFonts w:ascii="Cambria" w:hAnsi="Cambria"/>
-        </w:rPr>
         <w:lastRenderedPageBreak/>
-        <w:t>either structural or to the electrical or water connection, plumbing leaks, water seepage shall be attended to by the Lessor. In the event of the Lessor failing to carry out the repairs on receiving notice from the Lessee, the Lessee shall undertake the necessary repairs and the Lessor will be liable to immediately reimburse costs incurred by the Lessee.</w:t>
+        <w:t xml:space="preserve">That the </w:t>
+      </w:r>
+      <w:proofErr w:type="gramStart"/>
+      <w:r>
+        <w:rPr>
+          <w:rFonts w:ascii="Cambria" w:hAnsi="Cambria"/>
+        </w:rPr>
+        <w:t>day to day</w:t>
+      </w:r>
+      <w:proofErr w:type="gramEnd"/>
+      <w:r>
+        <w:rPr>
+          <w:rFonts w:ascii="Cambria" w:hAnsi="Cambria"/>
+        </w:rPr>
+        <w:t xml:space="preserve"> repair jobs such as fuse blow out, replacement of light bulbs/tubes, leakage of water taps, maintenance of the water pump and other minor repairs, etc., shall be </w:t>
+      </w:r>
+      <w:proofErr w:type="gramStart"/>
+      <w:r>
+        <w:rPr>
+          <w:rFonts w:ascii="Cambria" w:hAnsi="Cambria"/>
+        </w:rPr>
+        <w:t>effected</w:t>
+      </w:r>
+      <w:proofErr w:type="gramEnd"/>
+      <w:r>
+        <w:rPr>
+          <w:rFonts w:ascii="Cambria" w:hAnsi="Cambria"/>
+        </w:rPr>
+        <w:t xml:space="preserve"> by the Lessee at its own cost, and any major repairs, either structural or to the electrical or water connection, plumbing leaks, water seepage shall be attended to by the Lessor. In the event of the Lessor failing to carry out the repairs on receiving notice from the Lessee, the Lessee shall undertake the necessary repairs and the Lessor will be liable to immediately reimburse costs incurred by the Lessee.</w:t>
       </w:r>
     </w:p>
     <w:p>
@@ -1042,7 +1279,14 @@
         <w:rPr>
           <w:rFonts w:ascii="Cambria" w:hAnsi="Cambria"/>
         </w:rPr>
-        <w:t xml:space="preserve">On which Day of the month the monthly rent should be paid? </w:t>
+        <w:t>On which Day of the month the monthly rent should be paid</w:t>
+      </w:r>
+      <w:proofErr w:type="gramStart"/>
+      <w:r>
+        <w:rPr>
+          <w:rFonts w:ascii="Cambria" w:hAnsi="Cambria"/>
+        </w:rPr>
+        <w:t xml:space="preserve">? </w:t>
       </w:r>
       <w:r>
         <w:rPr>
@@ -1050,6 +1294,7 @@
         </w:rPr>
         <w:t>}</w:t>
       </w:r>
+      <w:proofErr w:type="gramEnd"/>
       <w:r>
         <w:rPr>
           <w:rFonts w:ascii="Cambria" w:hAnsi="Cambria"/>
@@ -1094,6 +1339,7 @@
         <w:rPr>
           <w:rFonts w:ascii="Cambria" w:hAnsi="Cambria"/>
         </w:rPr>
+        <w:lastRenderedPageBreak/>
         <w:t xml:space="preserve">That the Lessee has paid to the Lessor a sum of </w:t>
       </w:r>
       <w:r>
@@ -1118,14 +1364,7 @@
         <w:rPr>
           <w:rFonts w:ascii="Cambria" w:hAnsi="Cambria"/>
         </w:rPr>
-        <w:t xml:space="preserve"> as deposit, free of interest, which the Lessor does accept and acknowledge. This deposit is for the due performance and observance of the terms and conditions of this Agreement. The deposit shall be returned to the Lessee simultaneously with the </w:t>
-      </w:r>
-      <w:r>
-        <w:rPr>
-          <w:rFonts w:ascii="Cambria" w:hAnsi="Cambria"/>
-        </w:rPr>
-        <w:lastRenderedPageBreak/>
-        <w:t>Lessee vacating the said premises. In the event of failure on the part of the Lessor to refund the said deposit amount to the Lessee as aforesaid, the Lessee shall be entitled to continue to use and occupy the said premises without payment of any rent until the Lessor refunds the said amount</w:t>
+        <w:t xml:space="preserve"> as deposit, free of interest, which the Lessor does accept and acknowledge. This deposit is for the due performance and observance of the terms and conditions of this Agreement. The deposit shall be returned to the Lessee simultaneously with the Lessee vacating the said premises. In the event of failure on the part of the Lessor to refund the said deposit amount to the Lessee as aforesaid, the Lessee shall be entitled to continue to use and occupy the said premises without payment of any rent until the Lessor refunds the said amount</w:t>
       </w:r>
       <w:r>
         <w:rPr>
@@ -1274,11 +1513,19 @@
         </w:rPr>
         <w:t>{</w:t>
       </w:r>
-      <w:r>
-        <w:rPr>
-          <w:rFonts w:ascii="Cambria" w:hAnsi="Cambria"/>
-        </w:rPr>
-        <w:t>Tenants's Full Name</w:t>
+      <w:proofErr w:type="spellStart"/>
+      <w:r>
+        <w:rPr>
+          <w:rFonts w:ascii="Cambria" w:hAnsi="Cambria"/>
+        </w:rPr>
+        <w:t>Tenants's</w:t>
+      </w:r>
+      <w:proofErr w:type="spellEnd"/>
+      <w:r>
+        <w:rPr>
+          <w:rFonts w:ascii="Cambria" w:hAnsi="Cambria"/>
+        </w:rPr>
+        <w:t xml:space="preserve"> Full Name</w:t>
       </w:r>
       <w:r>
         <w:rPr>
@@ -1415,11 +1662,19 @@
         </w:rPr>
         <w:t>{</w:t>
       </w:r>
-      <w:r>
-        <w:rPr>
-          <w:rFonts w:ascii="Cambria" w:hAnsi="Cambria"/>
-        </w:rPr>
-        <w:t>City(Landlord)</w:t>
+      <w:proofErr w:type="gramStart"/>
+      <w:r>
+        <w:rPr>
+          <w:rFonts w:ascii="Cambria" w:hAnsi="Cambria"/>
+        </w:rPr>
+        <w:t>City(</w:t>
+      </w:r>
+      <w:proofErr w:type="gramEnd"/>
+      <w:r>
+        <w:rPr>
+          <w:rFonts w:ascii="Cambria" w:hAnsi="Cambria"/>
+        </w:rPr>
+        <w:t>Landlord)</w:t>
       </w:r>
       <w:r>
         <w:rPr>
@@ -1437,7 +1692,21 @@
         <w:rPr>
           <w:rFonts w:ascii="Cambria" w:hAnsi="Cambria"/>
         </w:rPr>
-        <w:t>{City(Tenant)}</w:t>
+        <w:t>{</w:t>
+      </w:r>
+      <w:proofErr w:type="gramStart"/>
+      <w:r>
+        <w:rPr>
+          <w:rFonts w:ascii="Cambria" w:hAnsi="Cambria"/>
+        </w:rPr>
+        <w:t>City(</w:t>
+      </w:r>
+      <w:proofErr w:type="gramEnd"/>
+      <w:r>
+        <w:rPr>
+          <w:rFonts w:ascii="Cambria" w:hAnsi="Cambria"/>
+        </w:rPr>
+        <w:t>Tenant)}</w:t>
       </w:r>
     </w:p>
     <w:p>
@@ -1464,17 +1733,27 @@
         </w:rPr>
         <w:t>State(landlord)</w:t>
       </w:r>
+      <w:proofErr w:type="gramStart"/>
       <w:r>
         <w:rPr>
           <w:rFonts w:ascii="Cambria" w:hAnsi="Cambria"/>
         </w:rPr>
         <w:t>},{</w:t>
       </w:r>
-      <w:r>
-        <w:rPr>
-          <w:rFonts w:ascii="Cambria" w:hAnsi="Cambria"/>
-        </w:rPr>
-        <w:t>Pincode(landlord)</w:t>
+      <w:proofErr w:type="spellStart"/>
+      <w:proofErr w:type="gramEnd"/>
+      <w:r>
+        <w:rPr>
+          <w:rFonts w:ascii="Cambria" w:hAnsi="Cambria"/>
+        </w:rPr>
+        <w:t>Pincode</w:t>
+      </w:r>
+      <w:proofErr w:type="spellEnd"/>
+      <w:r>
+        <w:rPr>
+          <w:rFonts w:ascii="Cambria" w:hAnsi="Cambria"/>
+        </w:rPr>
+        <w:t>(landlord)</w:t>
       </w:r>
       <w:r>
         <w:rPr>
@@ -1492,7 +1771,49 @@
         <w:rPr>
           <w:rFonts w:ascii="Cambria" w:hAnsi="Cambria"/>
         </w:rPr>
-        <w:t>{State(Tenant)},{Pincode(Tenant)}</w:t>
+        <w:t>{</w:t>
+      </w:r>
+      <w:proofErr w:type="gramStart"/>
+      <w:r>
+        <w:rPr>
+          <w:rFonts w:ascii="Cambria" w:hAnsi="Cambria"/>
+        </w:rPr>
+        <w:t>State(</w:t>
+      </w:r>
+      <w:proofErr w:type="gramEnd"/>
+      <w:r>
+        <w:rPr>
+          <w:rFonts w:ascii="Cambria" w:hAnsi="Cambria"/>
+        </w:rPr>
+        <w:t>Tenant)</w:t>
+      </w:r>
+      <w:proofErr w:type="gramStart"/>
+      <w:r>
+        <w:rPr>
+          <w:rFonts w:ascii="Cambria" w:hAnsi="Cambria"/>
+        </w:rPr>
+        <w:t>},{</w:t>
+      </w:r>
+      <w:proofErr w:type="spellStart"/>
+      <w:r>
+        <w:rPr>
+          <w:rFonts w:ascii="Cambria" w:hAnsi="Cambria"/>
+        </w:rPr>
+        <w:t>Pincode</w:t>
+      </w:r>
+      <w:proofErr w:type="spellEnd"/>
+      <w:r>
+        <w:rPr>
+          <w:rFonts w:ascii="Cambria" w:hAnsi="Cambria"/>
+        </w:rPr>
+        <w:t>(</w:t>
+      </w:r>
+      <w:proofErr w:type="gramEnd"/>
+      <w:r>
+        <w:rPr>
+          <w:rFonts w:ascii="Cambria" w:hAnsi="Cambria"/>
+        </w:rPr>
+        <w:t>Tenant)}</w:t>
       </w:r>
     </w:p>
     <w:p>
@@ -1580,199 +1901,33 @@
         <w:rPr>
           <w:rFonts w:ascii="Cambria" w:hAnsi="Cambria"/>
         </w:rPr>
-        <w:t>[</w:t>
-      </w:r>
-      <w:r>
-        <w:rPr>
-          <w:rFonts w:ascii="Cambria" w:hAnsi="Cambria"/>
-        </w:rPr>
-        <w:t xml:space="preserve">Name &amp; </w:t>
-      </w:r>
-      <w:r>
-        <w:rPr>
-          <w:rFonts w:ascii="Cambria" w:hAnsi="Cambria"/>
-        </w:rPr>
-        <w:t>Address]</w:t>
+        <w:lastRenderedPageBreak/>
+        <w:t>{Witness 1 Name}</w:t>
       </w:r>
       <w:r>
         <w:rPr>
           <w:rFonts w:ascii="Cambria" w:hAnsi="Cambria"/>
         </w:rPr>
         <w:tab/>
-        <w:t>[</w:t>
-      </w:r>
-      <w:r>
-        <w:rPr>
-          <w:rFonts w:ascii="Cambria" w:hAnsi="Cambria"/>
-        </w:rPr>
-        <w:t xml:space="preserve">Name &amp; </w:t>
-      </w:r>
-      <w:r>
-        <w:rPr>
-          <w:rFonts w:ascii="Cambria" w:hAnsi="Cambria"/>
-        </w:rPr>
-        <w:t>Address]</w:t>
-      </w:r>
-    </w:p>
-    <w:p>
-      <w:pPr>
-        <w:pStyle w:val="Heading2"/>
+      </w:r>
+      <w:r>
+        <w:rPr>
+          <w:rFonts w:ascii="Cambria" w:hAnsi="Cambria"/>
+        </w:rPr>
+        <w:t>{Witness 2 Name}</w:t>
+      </w:r>
+    </w:p>
+    <w:p>
+      <w:pPr>
+        <w:pStyle w:val="ListParagraph"/>
         <w:spacing w:line="360" w:lineRule="auto"/>
-        <w:jc w:val="center"/>
+        <w:ind w:left="0"/>
+        <w:jc w:val="both"/>
         <w:divId w:val="1478960584"/>
         <w:rPr>
           <w:rFonts w:ascii="Cambria" w:hAnsi="Cambria"/>
-          <w:caps/>
-          <w:sz w:val="32"/>
-          <w:szCs w:val="32"/>
-        </w:rPr>
-      </w:pPr>
-    </w:p>
-    <w:p>
-      <w:pPr>
-        <w:pStyle w:val="Heading2"/>
-        <w:spacing w:line="360" w:lineRule="auto"/>
-        <w:jc w:val="center"/>
-        <w:divId w:val="1478960584"/>
-        <w:rPr>
-          <w:rFonts w:ascii="Cambria" w:hAnsi="Cambria"/>
-          <w:caps/>
-          <w:sz w:val="32"/>
-          <w:szCs w:val="32"/>
-        </w:rPr>
-      </w:pPr>
-    </w:p>
-    <w:p>
-      <w:pPr>
-        <w:pStyle w:val="Heading2"/>
-        <w:spacing w:line="360" w:lineRule="auto"/>
-        <w:jc w:val="center"/>
-        <w:divId w:val="1478960584"/>
-        <w:rPr>
-          <w:rFonts w:ascii="Cambria" w:hAnsi="Cambria"/>
-          <w:caps/>
-          <w:sz w:val="32"/>
-          <w:szCs w:val="32"/>
-        </w:rPr>
-      </w:pPr>
-      <w:r>
-        <w:rPr>
-          <w:rFonts w:ascii="Cambria" w:hAnsi="Cambria"/>
-          <w:caps/>
-          <w:sz w:val="32"/>
-          <w:szCs w:val="32"/>
-        </w:rPr>
-        <w:t>ANNEXURE I</w:t>
-      </w:r>
-    </w:p>
-    <w:p>
-      <w:pPr>
-        <w:spacing w:line="360" w:lineRule="auto"/>
-        <w:jc w:val="both"/>
-        <w:divId w:val="1478960584"/>
-        <w:rPr>
-          <w:rFonts w:ascii="Cambria" w:hAnsi="Cambria"/>
-        </w:rPr>
-      </w:pPr>
-      <w:r>
-        <w:rPr>
-          <w:rFonts w:ascii="Cambria" w:hAnsi="Cambria"/>
-        </w:rPr>
-        <w:t>List of fixtures and fittings provided in</w:t>
-      </w:r>
-      <w:r>
-        <w:rPr>
-          <w:rFonts w:ascii="Cambria" w:hAnsi="Cambria"/>
-        </w:rPr>
-        <w:t>{Property Address Line</w:t>
-      </w:r>
-      <w:r>
-        <w:rPr>
-          <w:rFonts w:ascii="Cambria" w:hAnsi="Cambria"/>
-        </w:rPr>
-        <w:t xml:space="preserve"> </w:t>
-      </w:r>
-      <w:r>
-        <w:rPr>
-          <w:rFonts w:ascii="Cambria" w:hAnsi="Cambria"/>
-        </w:rPr>
-        <w:t>1}, {Property Address Line 2}, {City(Property)}, {State(Property) }, {Pincode(Property)}</w:t>
-      </w:r>
-      <w:r>
-        <w:rPr>
-          <w:rFonts w:ascii="Cambria" w:hAnsi="Cambria"/>
-        </w:rPr>
-        <w:t>:</w:t>
-      </w:r>
-      <w:r>
-        <w:rPr>
-          <w:rFonts w:ascii="Cambria" w:hAnsi="Cambria"/>
-        </w:rPr>
-        <w:t xml:space="preserve"> </w:t>
-      </w:r>
-    </w:p>
-    <w:p>
-      <w:pPr>
-        <w:pStyle w:val="ListParagraph"/>
-        <w:numPr>
-          <w:ilvl w:val="0"/>
-          <w:numId w:val="4"/>
-        </w:numPr>
-        <w:spacing w:line="360" w:lineRule="auto"/>
-        <w:jc w:val="both"/>
-        <w:divId w:val="1478960584"/>
-        <w:rPr>
-          <w:rFonts w:ascii="Cambria" w:hAnsi="Cambria"/>
-        </w:rPr>
-      </w:pPr>
-      <w:r>
-        <w:rPr>
-          <w:rFonts w:ascii="Cambria" w:hAnsi="Cambria"/>
-        </w:rPr>
-        <w:t xml:space="preserve">Item 1 </w:t>
-      </w:r>
-    </w:p>
-    <w:p>
-      <w:pPr>
-        <w:pStyle w:val="ListParagraph"/>
-        <w:numPr>
-          <w:ilvl w:val="0"/>
-          <w:numId w:val="4"/>
-        </w:numPr>
-        <w:spacing w:line="360" w:lineRule="auto"/>
-        <w:jc w:val="both"/>
-        <w:divId w:val="1478960584"/>
-        <w:rPr>
-          <w:rFonts w:ascii="Cambria" w:hAnsi="Cambria"/>
-        </w:rPr>
-      </w:pPr>
-      <w:r>
-        <w:rPr>
-          <w:rFonts w:ascii="Cambria" w:hAnsi="Cambria"/>
-        </w:rPr>
-        <w:t>Item 2</w:t>
-      </w:r>
-    </w:p>
-    <w:p>
-      <w:pPr>
-        <w:pStyle w:val="ListParagraph"/>
-        <w:numPr>
-          <w:ilvl w:val="0"/>
-          <w:numId w:val="4"/>
-        </w:numPr>
-        <w:spacing w:line="360" w:lineRule="auto"/>
-        <w:jc w:val="both"/>
-        <w:divId w:val="1478960584"/>
-        <w:rPr>
-          <w:rFonts w:ascii="Cambria" w:hAnsi="Cambria"/>
-        </w:rPr>
-      </w:pPr>
-      <w:r>
-        <w:rPr>
-          <w:rFonts w:ascii="Cambria" w:hAnsi="Cambria"/>
-        </w:rPr>
-        <w:t>Item 3</w:t>
-      </w:r>
+        </w:rPr>
+      </w:pPr>
     </w:p>
     <w:sectPr>
       <w:pgSz w:w="11906" w:h="16838"/>
@@ -2558,7 +2713,6 @@
   <w:style w:type="character" w:default="1" w:styleId="DefaultParagraphFont">
     <w:name w:val="Default Paragraph Font"/>
     <w:uiPriority w:val="1"/>
-    <w:semiHidden/>
     <w:unhideWhenUsed/>
   </w:style>
   <w:style w:type="table" w:default="1" w:styleId="TableNormal">
@@ -2642,6 +2796,30 @@
       <w:ind w:left="720"/>
       <w:contextualSpacing/>
     </w:pPr>
+  </w:style>
+  <w:style w:type="paragraph" w:styleId="HTMLPreformatted">
+    <w:name w:val="HTML Preformatted"/>
+    <w:basedOn w:val="Normal"/>
+    <w:link w:val="HTMLPreformattedChar"/>
+    <w:uiPriority w:val="99"/>
+    <w:semiHidden/>
+    <w:unhideWhenUsed/>
+    <w:rsid w:val="00911BAA"/>
+    <w:rPr>
+      <w:rFonts w:ascii="Courier New" w:hAnsi="Courier New" w:cs="Courier New"/>
+      <w:sz w:val="20"/>
+      <w:szCs w:val="20"/>
+    </w:rPr>
+  </w:style>
+  <w:style w:type="character" w:customStyle="1" w:styleId="HTMLPreformattedChar">
+    <w:name w:val="HTML Preformatted Char"/>
+    <w:link w:val="HTMLPreformatted"/>
+    <w:uiPriority w:val="99"/>
+    <w:semiHidden/>
+    <w:rsid w:val="00911BAA"/>
+    <w:rPr>
+      <w:rFonts w:ascii="Courier New" w:hAnsi="Courier New" w:cs="Courier New"/>
+    </w:rPr>
   </w:style>
 </w:styles>
 </file>

</xml_diff>

<commit_message>
Final Hai aur thoda aa sakta hai
</commit_message>
<xml_diff>
--- a/Server/templates/lease_template.docx
+++ b/Server/templates/lease_template.docx
@@ -234,17 +234,8 @@
           <w:rFonts w:ascii="Cambria" w:hAnsi="Cambria"/>
           <w:bCs/>
         </w:rPr>
-        <w:t xml:space="preserve">Agreement-Drafting </w:t>
-      </w:r>
-      <w:proofErr w:type="spellStart"/>
-      <w:r>
-        <w:rPr>
-          <w:rFonts w:ascii="Cambria" w:hAnsi="Cambria"/>
-          <w:bCs/>
-        </w:rPr>
-        <w:t>Pincode</w:t>
-      </w:r>
-      <w:proofErr w:type="spellEnd"/>
+        <w:t>Agreement-Drafting Pincode</w:t>
+      </w:r>
       <w:r>
         <w:rPr>
           <w:rFonts w:ascii="Cambria" w:hAnsi="Cambria"/>
@@ -334,19 +325,11 @@
         </w:rPr>
         <w:t>{</w:t>
       </w:r>
-      <w:proofErr w:type="spellStart"/>
-      <w:r>
-        <w:rPr>
-          <w:rFonts w:ascii="Cambria" w:hAnsi="Cambria"/>
-        </w:rPr>
-        <w:t>Pincode</w:t>
-      </w:r>
-      <w:proofErr w:type="spellEnd"/>
-      <w:r>
-        <w:rPr>
-          <w:rFonts w:ascii="Cambria" w:hAnsi="Cambria"/>
-        </w:rPr>
-        <w:t>(landlord)}</w:t>
+      <w:r>
+        <w:rPr>
+          <w:rFonts w:ascii="Cambria" w:hAnsi="Cambria"/>
+        </w:rPr>
+        <w:t>Pincode(landlord)}</w:t>
       </w:r>
       <w:r>
         <w:rPr>
@@ -372,19 +355,11 @@
         </w:rPr>
         <w:t>{</w:t>
       </w:r>
-      <w:proofErr w:type="spellStart"/>
-      <w:r>
-        <w:rPr>
-          <w:rFonts w:ascii="Cambria" w:hAnsi="Cambria"/>
-        </w:rPr>
-        <w:t>Tenants's</w:t>
-      </w:r>
-      <w:proofErr w:type="spellEnd"/>
-      <w:r>
-        <w:rPr>
-          <w:rFonts w:ascii="Cambria" w:hAnsi="Cambria"/>
-        </w:rPr>
-        <w:t xml:space="preserve"> Full Name</w:t>
+      <w:r>
+        <w:rPr>
+          <w:rFonts w:ascii="Cambria" w:hAnsi="Cambria"/>
+        </w:rPr>
+        <w:t>Tenants's Full Name</w:t>
       </w:r>
       <w:r>
         <w:rPr>
@@ -471,21 +446,7 @@
         <w:rPr>
           <w:rFonts w:ascii="Cambria" w:hAnsi="Cambria"/>
         </w:rPr>
-        <w:t>{</w:t>
-      </w:r>
-      <w:proofErr w:type="spellStart"/>
-      <w:r>
-        <w:rPr>
-          <w:rFonts w:ascii="Cambria" w:hAnsi="Cambria"/>
-        </w:rPr>
-        <w:t>Pincode</w:t>
-      </w:r>
-      <w:proofErr w:type="spellEnd"/>
-      <w:r>
-        <w:rPr>
-          <w:rFonts w:ascii="Cambria" w:hAnsi="Cambria"/>
-        </w:rPr>
-        <w:t>(Tenant)}</w:t>
+        <w:t>{Pincode(Tenant)}</w:t>
       </w:r>
       <w:r>
         <w:rPr>
@@ -525,21 +486,7 @@
         <w:rPr>
           <w:rFonts w:ascii="Cambria" w:hAnsi="Cambria"/>
         </w:rPr>
-        <w:t>1}, {Property Address Line 2}, {City(Property)}, {State(Property)}, {</w:t>
-      </w:r>
-      <w:proofErr w:type="spellStart"/>
-      <w:r>
-        <w:rPr>
-          <w:rFonts w:ascii="Cambria" w:hAnsi="Cambria"/>
-        </w:rPr>
-        <w:t>Pincode</w:t>
-      </w:r>
-      <w:proofErr w:type="spellEnd"/>
-      <w:r>
-        <w:rPr>
-          <w:rFonts w:ascii="Cambria" w:hAnsi="Cambria"/>
-        </w:rPr>
-        <w:t xml:space="preserve">(Property)} </w:t>
+        <w:t xml:space="preserve">1}, {Property Address Line 2}, {City(Property)}, {State(Property)}, {Pincode(Property)} </w:t>
       </w:r>
       <w:r>
         <w:rPr>
@@ -648,16 +595,8 @@
         <w:rPr>
           <w:rFonts w:ascii="Cambria" w:hAnsi="Cambria"/>
         </w:rPr>
-        <w:t xml:space="preserve">No. of Car </w:t>
-      </w:r>
-      <w:proofErr w:type="spellStart"/>
-      <w:r>
-        <w:rPr>
-          <w:rFonts w:ascii="Cambria" w:hAnsi="Cambria"/>
-        </w:rPr>
-        <w:t>Parkings</w:t>
-      </w:r>
-      <w:proofErr w:type="spellEnd"/>
+        <w:t>No. of Car Parkings</w:t>
+      </w:r>
       <w:r>
         <w:rPr>
           <w:rFonts w:ascii="Cambria" w:hAnsi="Cambria"/>
@@ -692,21 +631,7 @@
         <w:rPr>
           <w:rFonts w:ascii="Cambria" w:hAnsi="Cambria"/>
         </w:rPr>
-        <w:t xml:space="preserve">(in </w:t>
-      </w:r>
-      <w:proofErr w:type="spellStart"/>
-      <w:r>
-        <w:rPr>
-          <w:rFonts w:ascii="Cambria" w:hAnsi="Cambria"/>
-        </w:rPr>
-        <w:t>sqft</w:t>
-      </w:r>
-      <w:proofErr w:type="spellEnd"/>
-      <w:r>
-        <w:rPr>
-          <w:rFonts w:ascii="Cambria" w:hAnsi="Cambria"/>
-        </w:rPr>
-        <w:t>.)</w:t>
+        <w:t>(in sqft.)</w:t>
       </w:r>
       <w:r>
         <w:rPr>
@@ -718,84 +643,54 @@
         <w:rPr>
           <w:rFonts w:ascii="Cambria" w:hAnsi="Cambria"/>
         </w:rPr>
+        <w:t xml:space="preserve"> sqft. area</w:t>
+      </w:r>
+      <w:r>
+        <w:rPr>
+          <w:rFonts w:ascii="Cambria" w:hAnsi="Cambria"/>
+        </w:rPr>
+        <w:t xml:space="preserve"> hereinafter referred to as the `said premises`</w:t>
+      </w:r>
+    </w:p>
+    <w:p>
+      <w:pPr>
+        <w:spacing w:line="360" w:lineRule="auto"/>
+        <w:jc w:val="both"/>
+        <w:divId w:val="1931886249"/>
+        <w:rPr>
+          <w:rFonts w:ascii="Cambria" w:hAnsi="Cambria"/>
+        </w:rPr>
+      </w:pPr>
+      <w:r>
+        <w:rPr>
+          <w:rFonts w:ascii="Cambria" w:hAnsi="Cambria"/>
+        </w:rPr>
+        <w:t xml:space="preserve">AND WHEREAS at the request of the Lessee, the Lessor has agreed to let the said premises to the tenant for a term of </w:t>
+      </w:r>
+      <w:r>
+        <w:rPr>
+          <w:rFonts w:ascii="Cambria" w:hAnsi="Cambria"/>
+        </w:rPr>
+        <w:t>{</w:t>
+      </w:r>
+      <w:r>
+        <w:rPr>
+          <w:rFonts w:ascii="Cambria" w:hAnsi="Cambria"/>
+        </w:rPr>
+        <w:t>For how many Years/Months is the lease term?,years</w:t>
+      </w:r>
+      <w:r>
+        <w:rPr>
+          <w:rFonts w:ascii="Cambria" w:hAnsi="Cambria"/>
+        </w:rPr>
+        <w:t>}</w:t>
+      </w:r>
+      <w:r>
+        <w:rPr>
+          <w:rFonts w:ascii="Cambria" w:hAnsi="Cambria"/>
+        </w:rPr>
         <w:t xml:space="preserve"> </w:t>
       </w:r>
-      <w:proofErr w:type="spellStart"/>
-      <w:r>
-        <w:rPr>
-          <w:rFonts w:ascii="Cambria" w:hAnsi="Cambria"/>
-        </w:rPr>
-        <w:t>sqft</w:t>
-      </w:r>
-      <w:proofErr w:type="spellEnd"/>
-      <w:r>
-        <w:rPr>
-          <w:rFonts w:ascii="Cambria" w:hAnsi="Cambria"/>
-        </w:rPr>
-        <w:t>. area</w:t>
-      </w:r>
-      <w:r>
-        <w:rPr>
-          <w:rFonts w:ascii="Cambria" w:hAnsi="Cambria"/>
-        </w:rPr>
-        <w:t xml:space="preserve"> hereinafter referred to as the `said premises`; </w:t>
-      </w:r>
-    </w:p>
-    <w:p>
-      <w:pPr>
-        <w:spacing w:line="360" w:lineRule="auto"/>
-        <w:jc w:val="both"/>
-        <w:divId w:val="1931886249"/>
-        <w:rPr>
-          <w:rFonts w:ascii="Cambria" w:hAnsi="Cambria"/>
-        </w:rPr>
-      </w:pPr>
-      <w:r>
-        <w:rPr>
-          <w:rFonts w:ascii="Cambria" w:hAnsi="Cambria"/>
-        </w:rPr>
-        <w:t xml:space="preserve">AND WHEREAS at the request of the Lessee, the Lessor has agreed to let the said premises to the tenant for a term of </w:t>
-      </w:r>
-      <w:r>
-        <w:rPr>
-          <w:rFonts w:ascii="Cambria" w:hAnsi="Cambria"/>
-        </w:rPr>
-        <w:t>{</w:t>
-      </w:r>
-      <w:r>
-        <w:rPr>
-          <w:rFonts w:ascii="Cambria" w:hAnsi="Cambria"/>
-        </w:rPr>
-        <w:t xml:space="preserve">For how many Years/Months is the lease </w:t>
-      </w:r>
-      <w:proofErr w:type="spellStart"/>
-      <w:proofErr w:type="gramStart"/>
-      <w:r>
-        <w:rPr>
-          <w:rFonts w:ascii="Cambria" w:hAnsi="Cambria"/>
-        </w:rPr>
-        <w:t>term?,</w:t>
-      </w:r>
-      <w:proofErr w:type="gramEnd"/>
-      <w:r>
-        <w:rPr>
-          <w:rFonts w:ascii="Cambria" w:hAnsi="Cambria"/>
-        </w:rPr>
-        <w:t>years</w:t>
-      </w:r>
-      <w:proofErr w:type="spellEnd"/>
-      <w:r>
-        <w:rPr>
-          <w:rFonts w:ascii="Cambria" w:hAnsi="Cambria"/>
-        </w:rPr>
-        <w:t>}</w:t>
-      </w:r>
-      <w:r>
-        <w:rPr>
-          <w:rFonts w:ascii="Cambria" w:hAnsi="Cambria"/>
-        </w:rPr>
-        <w:t xml:space="preserve"> </w:t>
-      </w:r>
       <w:r>
         <w:rPr>
           <w:rFonts w:ascii="Cambria" w:hAnsi="Cambria"/>
@@ -806,16 +701,8 @@
         <w:rPr>
           <w:rFonts w:ascii="Cambria" w:hAnsi="Cambria"/>
         </w:rPr>
-        <w:t xml:space="preserve">For how many Years/Months is the lease </w:t>
-      </w:r>
-      <w:proofErr w:type="spellStart"/>
-      <w:r>
-        <w:rPr>
-          <w:rFonts w:ascii="Cambria" w:hAnsi="Cambria"/>
-        </w:rPr>
-        <w:t>term?,months</w:t>
-      </w:r>
-      <w:proofErr w:type="spellEnd"/>
+        <w:t>For how many Years/Months is the lease term?,months</w:t>
+      </w:r>
       <w:r>
         <w:rPr>
           <w:rFonts w:ascii="Cambria" w:hAnsi="Cambria"/>
@@ -940,24 +827,8 @@
         <w:rPr>
           <w:rFonts w:ascii="Cambria" w:hAnsi="Cambria"/>
         </w:rPr>
-        <w:t xml:space="preserve">For how many Years/Months is the lease </w:t>
-      </w:r>
-      <w:proofErr w:type="spellStart"/>
-      <w:proofErr w:type="gramStart"/>
-      <w:r>
-        <w:rPr>
-          <w:rFonts w:ascii="Cambria" w:hAnsi="Cambria"/>
-        </w:rPr>
-        <w:t>term?,</w:t>
-      </w:r>
-      <w:proofErr w:type="gramEnd"/>
-      <w:r>
-        <w:rPr>
-          <w:rFonts w:ascii="Cambria" w:hAnsi="Cambria"/>
-        </w:rPr>
-        <w:t>years</w:t>
-      </w:r>
-      <w:proofErr w:type="spellEnd"/>
+        <w:t>For how many Years/Months is the lease term?,years</w:t>
+      </w:r>
       <w:r>
         <w:rPr>
           <w:rFonts w:ascii="Cambria" w:hAnsi="Cambria"/>
@@ -980,16 +851,8 @@
         <w:rPr>
           <w:rFonts w:ascii="Cambria" w:hAnsi="Cambria"/>
         </w:rPr>
-        <w:t xml:space="preserve">For how many Years/Months is the lease </w:t>
-      </w:r>
-      <w:proofErr w:type="spellStart"/>
-      <w:r>
-        <w:rPr>
-          <w:rFonts w:ascii="Cambria" w:hAnsi="Cambria"/>
-        </w:rPr>
-        <w:t>term?,months</w:t>
-      </w:r>
-      <w:proofErr w:type="spellEnd"/>
+        <w:t>For how many Years/Months is the lease term?,months</w:t>
+      </w:r>
       <w:r>
         <w:rPr>
           <w:rFonts w:ascii="Cambria" w:hAnsi="Cambria"/>
@@ -1131,35 +994,7 @@
           <w:rFonts w:ascii="Cambria" w:hAnsi="Cambria"/>
         </w:rPr>
         <w:lastRenderedPageBreak/>
-        <w:t xml:space="preserve">That the </w:t>
-      </w:r>
-      <w:proofErr w:type="gramStart"/>
-      <w:r>
-        <w:rPr>
-          <w:rFonts w:ascii="Cambria" w:hAnsi="Cambria"/>
-        </w:rPr>
-        <w:t>day to day</w:t>
-      </w:r>
-      <w:proofErr w:type="gramEnd"/>
-      <w:r>
-        <w:rPr>
-          <w:rFonts w:ascii="Cambria" w:hAnsi="Cambria"/>
-        </w:rPr>
-        <w:t xml:space="preserve"> repair jobs such as fuse blow out, replacement of light bulbs/tubes, leakage of water taps, maintenance of the water pump and other minor repairs, etc., shall be </w:t>
-      </w:r>
-      <w:proofErr w:type="gramStart"/>
-      <w:r>
-        <w:rPr>
-          <w:rFonts w:ascii="Cambria" w:hAnsi="Cambria"/>
-        </w:rPr>
-        <w:t>effected</w:t>
-      </w:r>
-      <w:proofErr w:type="gramEnd"/>
-      <w:r>
-        <w:rPr>
-          <w:rFonts w:ascii="Cambria" w:hAnsi="Cambria"/>
-        </w:rPr>
-        <w:t xml:space="preserve"> by the Lessee at its own cost, and any major repairs, either structural or to the electrical or water connection, plumbing leaks, water seepage shall be attended to by the Lessor. In the event of the Lessor failing to carry out the repairs on receiving notice from the Lessee, the Lessee shall undertake the necessary repairs and the Lessor will be liable to immediately reimburse costs incurred by the Lessee.</w:t>
+        <w:t>That the day to day repair jobs such as fuse blow out, replacement of light bulbs/tubes, leakage of water taps, maintenance of the water pump and other minor repairs, etc., shall be effected by the Lessee at its own cost, and any major repairs, either structural or to the electrical or water connection, plumbing leaks, water seepage shall be attended to by the Lessor. In the event of the Lessor failing to carry out the repairs on receiving notice from the Lessee, the Lessee shall undertake the necessary repairs and the Lessor will be liable to immediately reimburse costs incurred by the Lessee.</w:t>
       </w:r>
     </w:p>
     <w:p>
@@ -1279,14 +1114,7 @@
         <w:rPr>
           <w:rFonts w:ascii="Cambria" w:hAnsi="Cambria"/>
         </w:rPr>
-        <w:t>On which Day of the month the monthly rent should be paid</w:t>
-      </w:r>
-      <w:proofErr w:type="gramStart"/>
-      <w:r>
-        <w:rPr>
-          <w:rFonts w:ascii="Cambria" w:hAnsi="Cambria"/>
-        </w:rPr>
-        <w:t xml:space="preserve">? </w:t>
+        <w:t xml:space="preserve">On which Day of the month the monthly rent should be paid? </w:t>
       </w:r>
       <w:r>
         <w:rPr>
@@ -1294,7 +1122,6 @@
         </w:rPr>
         <w:t>}</w:t>
       </w:r>
-      <w:proofErr w:type="gramEnd"/>
       <w:r>
         <w:rPr>
           <w:rFonts w:ascii="Cambria" w:hAnsi="Cambria"/>
@@ -1513,19 +1340,11 @@
         </w:rPr>
         <w:t>{</w:t>
       </w:r>
-      <w:proofErr w:type="spellStart"/>
-      <w:r>
-        <w:rPr>
-          <w:rFonts w:ascii="Cambria" w:hAnsi="Cambria"/>
-        </w:rPr>
-        <w:t>Tenants's</w:t>
-      </w:r>
-      <w:proofErr w:type="spellEnd"/>
-      <w:r>
-        <w:rPr>
-          <w:rFonts w:ascii="Cambria" w:hAnsi="Cambria"/>
-        </w:rPr>
-        <w:t xml:space="preserve"> Full Name</w:t>
+      <w:r>
+        <w:rPr>
+          <w:rFonts w:ascii="Cambria" w:hAnsi="Cambria"/>
+        </w:rPr>
+        <w:t>Tenants's Full Name</w:t>
       </w:r>
       <w:r>
         <w:rPr>
@@ -1662,19 +1481,11 @@
         </w:rPr>
         <w:t>{</w:t>
       </w:r>
-      <w:proofErr w:type="gramStart"/>
-      <w:r>
-        <w:rPr>
-          <w:rFonts w:ascii="Cambria" w:hAnsi="Cambria"/>
-        </w:rPr>
-        <w:t>City(</w:t>
-      </w:r>
-      <w:proofErr w:type="gramEnd"/>
-      <w:r>
-        <w:rPr>
-          <w:rFonts w:ascii="Cambria" w:hAnsi="Cambria"/>
-        </w:rPr>
-        <w:t>Landlord)</w:t>
+      <w:r>
+        <w:rPr>
+          <w:rFonts w:ascii="Cambria" w:hAnsi="Cambria"/>
+        </w:rPr>
+        <w:t>City(Landlord)</w:t>
       </w:r>
       <w:r>
         <w:rPr>
@@ -1692,21 +1503,7 @@
         <w:rPr>
           <w:rFonts w:ascii="Cambria" w:hAnsi="Cambria"/>
         </w:rPr>
-        <w:t>{</w:t>
-      </w:r>
-      <w:proofErr w:type="gramStart"/>
-      <w:r>
-        <w:rPr>
-          <w:rFonts w:ascii="Cambria" w:hAnsi="Cambria"/>
-        </w:rPr>
-        <w:t>City(</w:t>
-      </w:r>
-      <w:proofErr w:type="gramEnd"/>
-      <w:r>
-        <w:rPr>
-          <w:rFonts w:ascii="Cambria" w:hAnsi="Cambria"/>
-        </w:rPr>
-        <w:t>Tenant)}</w:t>
+        <w:t>{City(Tenant)}</w:t>
       </w:r>
     </w:p>
     <w:p>
@@ -1733,27 +1530,17 @@
         </w:rPr>
         <w:t>State(landlord)</w:t>
       </w:r>
-      <w:proofErr w:type="gramStart"/>
       <w:r>
         <w:rPr>
           <w:rFonts w:ascii="Cambria" w:hAnsi="Cambria"/>
         </w:rPr>
         <w:t>},{</w:t>
       </w:r>
-      <w:proofErr w:type="spellStart"/>
-      <w:proofErr w:type="gramEnd"/>
-      <w:r>
-        <w:rPr>
-          <w:rFonts w:ascii="Cambria" w:hAnsi="Cambria"/>
-        </w:rPr>
-        <w:t>Pincode</w:t>
-      </w:r>
-      <w:proofErr w:type="spellEnd"/>
-      <w:r>
-        <w:rPr>
-          <w:rFonts w:ascii="Cambria" w:hAnsi="Cambria"/>
-        </w:rPr>
-        <w:t>(landlord)</w:t>
+      <w:r>
+        <w:rPr>
+          <w:rFonts w:ascii="Cambria" w:hAnsi="Cambria"/>
+        </w:rPr>
+        <w:t>Pincode(landlord)</w:t>
       </w:r>
       <w:r>
         <w:rPr>
@@ -1771,49 +1558,7 @@
         <w:rPr>
           <w:rFonts w:ascii="Cambria" w:hAnsi="Cambria"/>
         </w:rPr>
-        <w:t>{</w:t>
-      </w:r>
-      <w:proofErr w:type="gramStart"/>
-      <w:r>
-        <w:rPr>
-          <w:rFonts w:ascii="Cambria" w:hAnsi="Cambria"/>
-        </w:rPr>
-        <w:t>State(</w:t>
-      </w:r>
-      <w:proofErr w:type="gramEnd"/>
-      <w:r>
-        <w:rPr>
-          <w:rFonts w:ascii="Cambria" w:hAnsi="Cambria"/>
-        </w:rPr>
-        <w:t>Tenant)</w:t>
-      </w:r>
-      <w:proofErr w:type="gramStart"/>
-      <w:r>
-        <w:rPr>
-          <w:rFonts w:ascii="Cambria" w:hAnsi="Cambria"/>
-        </w:rPr>
-        <w:t>},{</w:t>
-      </w:r>
-      <w:proofErr w:type="spellStart"/>
-      <w:r>
-        <w:rPr>
-          <w:rFonts w:ascii="Cambria" w:hAnsi="Cambria"/>
-        </w:rPr>
-        <w:t>Pincode</w:t>
-      </w:r>
-      <w:proofErr w:type="spellEnd"/>
-      <w:r>
-        <w:rPr>
-          <w:rFonts w:ascii="Cambria" w:hAnsi="Cambria"/>
-        </w:rPr>
-        <w:t>(</w:t>
-      </w:r>
-      <w:proofErr w:type="gramEnd"/>
-      <w:r>
-        <w:rPr>
-          <w:rFonts w:ascii="Cambria" w:hAnsi="Cambria"/>
-        </w:rPr>
-        <w:t>Tenant)}</w:t>
+        <w:t>{State(Tenant)},{Pincode(Tenant)}</w:t>
       </w:r>
     </w:p>
     <w:p>
@@ -2713,6 +2458,7 @@
   <w:style w:type="character" w:default="1" w:styleId="DefaultParagraphFont">
     <w:name w:val="Default Paragraph Font"/>
     <w:uiPriority w:val="1"/>
+    <w:semiHidden/>
     <w:unhideWhenUsed/>
   </w:style>
   <w:style w:type="table" w:default="1" w:styleId="TableNormal">

</xml_diff>